<commit_message>
Spanish Part 3: episodes 29-31 and 35-37; align ep39 Houston price with ep35, rename ep39 bartender
Co-Authored-By: Claude Opus 5.5 <noreply@anthropic.com>
Claude-Session: https://claude.ai/code/session_014Pwa4fJotSRvNewqVrvk7U
</commit_message>
<xml_diff>
--- a/business_es/part3/ep39_Solo_en_Houston.docx
+++ b/business_es/part3/ep39_Solo_en_Houston.docx
@@ -180,7 +180,7 @@
                 <w:b w:val="0"/>
                 <w:sz w:val="19"/>
               </w:rPr>
-              <w:t>Lucas Ferrer (수출 책임자) · Roy Delgado (론오크 홈스 구매 부사장) · Sandra Villarreal (론오크 홈스 구매 담당) · Amparo Albalat (국내영업 책임자, 화상·전화) · Lalo (호텔 바텐더)</w:t>
+              <w:t>Lucas Ferrer (수출 책임자) · Roy Delgado (론오크 홈스 구매 부사장) · Sandra Villarreal (론오크 홈스 구매 담당) · Amparo Albalat (국내영업 책임자, 화상·전화) · Neto (호텔 바텐더)</w:t>
             </w:r>
           </w:p>
         </w:tc>
@@ -303,7 +303,7 @@
                 <w:b w:val="0"/>
                 <w:sz w:val="19"/>
               </w:rPr>
-              <w:t>대화 120턴 (Lucas 56 · Roy 26 · Amparo 16 · Sandra 15 · Lalo 7) · A2 10% / B1 35% / B2 40% / C1 15% 목표</w:t>
+              <w:t>대화 120턴 (Lucas 56 · Roy 26 · Amparo 16 · Sandra 15 · Neto 7) · A2 10% / B1 35% / B2 40% / C1 15% 목표</w:t>
             </w:r>
           </w:p>
         </w:tc>
@@ -857,7 +857,7 @@
           <w:sz w:val="22"/>
         </w:rPr>
         <w:tab/>
-        <w:t>Página uno: precio puesto en su almacén de Houston, un dólar con setenta el pie cuadrado. Página dos: su proveedor actual, según Sandra, un dólar con sesenta y cinco.</w:t>
+        <w:t>Página uno: precio puesto en su almacén de Houston, un dólar con noventa el pie cuadrado. Página dos: su proveedor actual, según Sandra, un dólar con ochenta y cinco.</w:t>
       </w:r>
     </w:p>
     <w:p>
@@ -1500,7 +1500,7 @@
           <w:color w:val="666666"/>
           <w:sz w:val="19"/>
         </w:rPr>
-        <w:t>Un hotel de negocios junto a la autopista. Lucas cena una hamburguesa en la barra. El bartender, Lalo, lleva una camiseta de los Astros.</w:t>
+        <w:t>Un hotel de negocios junto a la autopista. Lucas cena una hamburguesa en la barra. El bartender, Neto, lleva una camiseta de los Astros.</w:t>
       </w:r>
     </w:p>
     <w:p>
@@ -1518,7 +1518,7 @@
           <w:color w:val="7A1F3D"/>
           <w:sz w:val="21"/>
         </w:rPr>
-        <w:t>Lalo:</w:t>
+        <w:t>Neto:</w:t>
       </w:r>
       <w:r>
         <w:rPr>
@@ -1570,7 +1570,7 @@
           <w:color w:val="7A1F3D"/>
           <w:sz w:val="21"/>
         </w:rPr>
-        <w:t>Lalo:</w:t>
+        <w:t>Neto:</w:t>
       </w:r>
       <w:r>
         <w:rPr>
@@ -1622,7 +1622,7 @@
           <w:color w:val="7A1F3D"/>
           <w:sz w:val="21"/>
         </w:rPr>
-        <w:t>Lalo:</w:t>
+        <w:t>Neto:</w:t>
       </w:r>
       <w:r>
         <w:rPr>
@@ -1674,7 +1674,7 @@
           <w:color w:val="7A1F3D"/>
           <w:sz w:val="21"/>
         </w:rPr>
-        <w:t>Lalo:</w:t>
+        <w:t>Neto:</w:t>
       </w:r>
       <w:r>
         <w:rPr>
@@ -1726,7 +1726,7 @@
           <w:color w:val="7A1F3D"/>
           <w:sz w:val="21"/>
         </w:rPr>
-        <w:t>Lalo:</w:t>
+        <w:t>Neto:</w:t>
       </w:r>
       <w:r>
         <w:rPr>
@@ -1778,7 +1778,7 @@
           <w:color w:val="7A1F3D"/>
           <w:sz w:val="21"/>
         </w:rPr>
-        <w:t>Lalo:</w:t>
+        <w:t>Neto:</w:t>
       </w:r>
       <w:r>
         <w:rPr>
@@ -1830,7 +1830,7 @@
           <w:color w:val="7A1F3D"/>
           <w:sz w:val="21"/>
         </w:rPr>
-        <w:t>Lalo:</w:t>
+        <w:t>Neto:</w:t>
       </w:r>
       <w:r>
         <w:rPr>
@@ -3786,7 +3786,7 @@
           <w:color w:val="666666"/>
           <w:sz w:val="18"/>
         </w:rPr>
-        <w:t>휴스턴의 로이, 샌안토니오의 산드라, 호텔 바의 랄로는 텍사스 멕시코계 스페인어(Tex-Mex)를 씁니다.</w:t>
+        <w:t>휴스턴의 로이, 샌안토니오의 산드라, 호텔 바의 네토는 텍사스 멕시코계 스페인어(Tex-Mex)를 씁니다.</w:t>
       </w:r>
     </w:p>
     <w:tbl>
@@ -7859,7 +7859,7 @@
           <w:sz w:val="21"/>
         </w:rPr>
         <w:tab/>
-        <w:t>첫 장: 휴스턴 창고 도착 가격, 평방피트당 1달러 70센트. 둘째 장: 산드라 말로는 지금 공급업체가 1달러 65센트.</w:t>
+        <w:t>첫 장: 휴스턴 창고 도착 가격, 평방피트당 1달러 90센트. 둘째 장: 산드라 말로는 지금 공급업체가 1달러 85센트.</w:t>
       </w:r>
     </w:p>
     <w:p>
@@ -8503,7 +8503,7 @@
           <w:color w:val="666666"/>
           <w:sz w:val="19"/>
         </w:rPr>
-        <w:t>고속도로 옆 비즈니스호텔. 루카스가 바에서 햄버거로 저녁을 먹는다. 바텐더 랄로는 애스트로스 티셔츠를 입고 있다.</w:t>
+        <w:t>고속도로 옆 비즈니스호텔. 루카스가 바에서 햄버거로 저녁을 먹는다. 바텐더 네토는 애스트로스 티셔츠를 입고 있다.</w:t>
       </w:r>
     </w:p>
     <w:p>
@@ -8521,7 +8521,7 @@
           <w:color w:val="7A1F3D"/>
           <w:sz w:val="21"/>
         </w:rPr>
-        <w:t>Lalo:</w:t>
+        <w:t>Neto:</w:t>
       </w:r>
       <w:r>
         <w:rPr>
@@ -8573,7 +8573,7 @@
           <w:color w:val="7A1F3D"/>
           <w:sz w:val="21"/>
         </w:rPr>
-        <w:t>Lalo:</w:t>
+        <w:t>Neto:</w:t>
       </w:r>
       <w:r>
         <w:rPr>
@@ -8625,7 +8625,7 @@
           <w:color w:val="7A1F3D"/>
           <w:sz w:val="21"/>
         </w:rPr>
-        <w:t>Lalo:</w:t>
+        <w:t>Neto:</w:t>
       </w:r>
       <w:r>
         <w:rPr>
@@ -8677,7 +8677,7 @@
           <w:color w:val="7A1F3D"/>
           <w:sz w:val="21"/>
         </w:rPr>
-        <w:t>Lalo:</w:t>
+        <w:t>Neto:</w:t>
       </w:r>
       <w:r>
         <w:rPr>
@@ -8729,7 +8729,7 @@
           <w:color w:val="7A1F3D"/>
           <w:sz w:val="21"/>
         </w:rPr>
-        <w:t>Lalo:</w:t>
+        <w:t>Neto:</w:t>
       </w:r>
       <w:r>
         <w:rPr>
@@ -8781,7 +8781,7 @@
           <w:color w:val="7A1F3D"/>
           <w:sz w:val="21"/>
         </w:rPr>
-        <w:t>Lalo:</w:t>
+        <w:t>Neto:</w:t>
       </w:r>
       <w:r>
         <w:rPr>
@@ -8833,7 +8833,7 @@
           <w:color w:val="7A1F3D"/>
           <w:sz w:val="21"/>
         </w:rPr>
-        <w:t>Lalo:</w:t>
+        <w:t>Neto:</w:t>
       </w:r>
       <w:r>
         <w:rPr>

</xml_diff>